<commit_message>
agrega funcionalidad de poder cambiar el nombre de columnas para que sea mas dinamico
</commit_message>
<xml_diff>
--- a/MANUAL_USUARIO.docx
+++ b/MANUAL_USUARIO.docx
@@ -70,7 +70,7 @@
         <w:rPr>
           <w:color w:val="64748B"/>
         </w:rPr>
-        <w:t>Versión 1.0  |  Mayo 2026  |  Lambda Analytics</w:t>
+        <w:t>Versión 1.1  |  Junio 2026  |  Lambda Analytics</w:t>
       </w:r>
     </w:p>
     <w:p>
@@ -131,11 +131,9 @@
         <w:rPr>
           <w:b/>
         </w:rPr>
-        <w:t>Versión:</w:t>
-      </w:r>
-      <w:r>
-        <w:t xml:space="preserve"> 1.0</w:t>
-      </w:r>
+        <w:t>Versión: 1.1</w:t>
+      </w:r>
+      <w:r/>
     </w:p>
     <w:p>
       <w:pPr>
@@ -145,11 +143,9 @@
         <w:rPr>
           <w:b/>
         </w:rPr>
-        <w:t>Fecha:</w:t>
-      </w:r>
-      <w:r>
-        <w:t xml:space="preserve"> Mayo 2026</w:t>
-      </w:r>
+        <w:t>Fecha: Junio 2026</w:t>
+      </w:r>
+      <w:r/>
     </w:p>
     <w:p>
       <w:pPr>
@@ -3632,6 +3628,251 @@
       <w:pPr>
         <w:spacing w:after="40"/>
       </w:pPr>
+    </w:p>
+    <w:p>
+      <w:pPr>
+        <w:pStyle w:val="Ttulo3"/>
+      </w:pPr>
+      <w:r>
+        <w:t>4.3 Configuración de columnas (Mapeo dinámico)</w:t>
+      </w:r>
+    </w:p>
+    <w:p>
+      <w:pPr/>
+    </w:p>
+    <w:p>
+      <w:pPr/>
+      <w:r>
+        <w:t>INEDITTO ocasionalmente actualiza los nombres de columnas en sus exportaciones. SeedPack Planner incluye dos mecanismos complementarios para adaptarse a estos cambios sin necesidad de modificar el código: la validación automática al cargar archivos y el modal maestro de mapeo de columnas.</w:t>
+      </w:r>
+    </w:p>
+    <w:p>
+      <w:pPr/>
+    </w:p>
+    <w:p>
+      <w:pPr>
+        <w:pStyle w:val="Ttulo4"/>
+      </w:pPr>
+      <w:r>
+        <w:t>Validación automática al cargar archivos</w:t>
+      </w:r>
+    </w:p>
+    <w:p>
+      <w:pPr/>
+    </w:p>
+    <w:p>
+      <w:pPr/>
+      <w:r>
+        <w:t>Cada vez que se selecciona un archivo con los botones "Examinar" o "Actualizar", el sistema valida en segundo plano que todas las columnas requeridas estén presentes.</w:t>
+      </w:r>
+    </w:p>
+    <w:p>
+      <w:pPr/>
+    </w:p>
+    <w:p>
+      <w:pPr/>
+      <w:r>
+        <w:t>Comportamiento normal (sin problemas):</w:t>
+      </w:r>
+    </w:p>
+    <w:p>
+      <w:pPr>
+        <w:pStyle w:val="Listaconvietas"/>
+      </w:pPr>
+      <w:r>
+        <w:t>La tarjeta del archivo cambia a verde de forma silenciosa. No aparece ningún modal ni interrupción.</w:t>
+      </w:r>
+    </w:p>
+    <w:p>
+      <w:pPr/>
+    </w:p>
+    <w:p>
+      <w:pPr/>
+      <w:r>
+        <w:t>Comportamiento cuando hay columnas faltantes:</w:t>
+      </w:r>
+    </w:p>
+    <w:p>
+      <w:pPr>
+        <w:pStyle w:val="Listaconvietas"/>
+      </w:pPr>
+      <w:r>
+        <w:t>Se abre automáticamente un modal contextual que muestra únicamente los campos requeridos que no se encontraron en el archivo.</w:t>
+      </w:r>
+    </w:p>
+    <w:p>
+      <w:pPr/>
+    </w:p>
+    <w:p>
+      <w:pPr/>
+      <w:r>
+        <w:t>El modal de validación contiene:</w:t>
+      </w:r>
+    </w:p>
+    <w:p>
+      <w:pPr>
+        <w:pStyle w:val="Listaconvietas"/>
+      </w:pPr>
+      <w:r>
+        <w:t>Banner de advertencia: indica el nombre del archivo y cuántos campos tienen problema.</w:t>
+      </w:r>
+    </w:p>
+    <w:p>
+      <w:pPr>
+        <w:pStyle w:val="Listaconvietas"/>
+      </w:pPr>
+      <w:r>
+        <w:t>Tabla compacta: columna «Campo esperado» (marcado con *) y columna «Columna detectada más parecida» (pre-seleccionada automáticamente con el badge «sugerido»).</w:t>
+      </w:r>
+    </w:p>
+    <w:p>
+      <w:pPr>
+        <w:pStyle w:val="Listaconvietas"/>
+      </w:pPr>
+      <w:r>
+        <w:t>Botón "Guardar mapeo": guarda la correspondencia en column_mappings.json y se aplica en todas las ejecuciones futuras.</w:t>
+      </w:r>
+    </w:p>
+    <w:p>
+      <w:pPr>
+        <w:pStyle w:val="Listaconvietas"/>
+      </w:pPr>
+      <w:r>
+        <w:t>Botón "Continuar sin cambios": cierra el modal sin guardar. El plan puede ejecutarse igualmente, aunque es posible que ese archivo falle en el pipeline.</w:t>
+      </w:r>
+    </w:p>
+    <w:p>
+      <w:pPr/>
+    </w:p>
+    <w:p>
+      <w:pPr/>
+      <w:r>
+        <w:t>Nota: Este modal solo aparece cuando INEDITTO actualiza su exportación y cambia algún nombre de columna requerida. En el uso cotidiano normal no hay ninguna interrupción.</w:t>
+      </w:r>
+    </w:p>
+    <w:p>
+      <w:pPr/>
+    </w:p>
+    <w:p>
+      <w:pPr>
+        <w:pStyle w:val="Ttulo4"/>
+      </w:pPr>
+      <w:r>
+        <w:t>Botón "Mapeo de columnas" — Modal maestro</w:t>
+      </w:r>
+    </w:p>
+    <w:p>
+      <w:pPr/>
+    </w:p>
+    <w:p>
+      <w:pPr/>
+      <w:r>
+        <w:t>Ubicación: Pestaña «Ordenes de Producción», junto al encabezado "ARCHIVOS DE ENTRADA" (esquina superior derecha del panel de archivos).</w:t>
+      </w:r>
+    </w:p>
+    <w:p>
+      <w:pPr/>
+    </w:p>
+    <w:p>
+      <w:pPr/>
+      <w:r>
+        <w:t>Propósito: Permite revisar y configurar manualmente la correspondencia entre los campos que espera el sistema y las columnas reales del archivo Excel en cualquier momento, no solo al momento de cargar un archivo.</w:t>
+      </w:r>
+    </w:p>
+    <w:p>
+      <w:pPr/>
+    </w:p>
+    <w:p>
+      <w:pPr/>
+      <w:r>
+        <w:t>Cómo funciona:</w:t>
+      </w:r>
+    </w:p>
+    <w:p>
+      <w:pPr>
+        <w:pStyle w:val="Listaconvietas"/>
+      </w:pPr>
+      <w:r>
+        <w:t>Al hacer clic en "Mapeo de columnas" se abre un modal con una pestaña por cada archivo de entrada: Historial de Ventas, Bodega/Existencias, Listado de Pedidos, OPs en Proceso, Histórico de OPs y Entradas de Inventario.</w:t>
+      </w:r>
+    </w:p>
+    <w:p>
+      <w:pPr>
+        <w:pStyle w:val="Listaconvietas"/>
+      </w:pPr>
+      <w:r>
+        <w:t>Cada pestaña muestra una tabla de dos columnas: «Campo que espera el sistema» (izquierda) y «Columna en tu archivo Excel» (derecha, dropdown).</w:t>
+      </w:r>
+    </w:p>
+    <w:p>
+      <w:pPr>
+        <w:pStyle w:val="Listaconvietas"/>
+      </w:pPr>
+      <w:r>
+        <w:t>Si el archivo está cargado, el dropdown muestra todas sus columnas reales para elegir. Si el archivo aún no está cargado, aparece un campo de texto para escribir el nombre manualmente.</w:t>
+      </w:r>
+    </w:p>
+    <w:p>
+      <w:pPr>
+        <w:pStyle w:val="Listaconvietas"/>
+      </w:pPr>
+      <w:r>
+        <w:t>Una barra azul lateral identifica los campos marcados como requeridos (*).</w:t>
+      </w:r>
+    </w:p>
+    <w:p>
+      <w:pPr/>
+    </w:p>
+    <w:p>
+      <w:pPr/>
+      <w:r>
+        <w:t>Botones del modal:</w:t>
+      </w:r>
+    </w:p>
+    <w:p>
+      <w:pPr>
+        <w:pStyle w:val="Listaconvietas"/>
+      </w:pPr>
+      <w:r>
+        <w:t>Guardar cambios: persiste el mapeo en el archivo column_mappings.json. El mapeo se aplica automáticamente en el próximo «Generar Plan».</w:t>
+      </w:r>
+    </w:p>
+    <w:p>
+      <w:pPr>
+        <w:pStyle w:val="Listaconvietas"/>
+      </w:pPr>
+      <w:r>
+        <w:t>Limpiar todo: resetea todos los campos a «(Sin cambio)», eliminando cualquier mapeo guardado.</w:t>
+      </w:r>
+    </w:p>
+    <w:p>
+      <w:pPr>
+        <w:pStyle w:val="Listaconvietas"/>
+      </w:pPr>
+      <w:r>
+        <w:t>Cancelar: cierra el modal sin guardar ningún cambio.</w:t>
+      </w:r>
+    </w:p>
+    <w:p>
+      <w:pPr/>
+    </w:p>
+    <w:p>
+      <w:pPr/>
+      <w:r>
+        <w:t>Cuándo usarlo: Únicamente cuando INEDITTO cambia el nombre de una columna y la validación automática no se activó (por ejemplo, si el archivo fue cargado antes del cambio). Si el archivo funciona correctamente, deje todos los campos en "(Sin cambio)".</w:t>
+      </w:r>
+    </w:p>
+    <w:p>
+      <w:pPr/>
+    </w:p>
+    <w:p>
+      <w:pPr/>
+      <w:r>
+        <w:t>Nota sobre el scroll: El scroll del mouse sobre un dropdown NO cambia su valor seleccionado. Solo se cambia con un clic explícito sobre la opción deseada.</w:t>
+      </w:r>
+    </w:p>
+    <w:p>
+      <w:pPr/>
     </w:p>
     <w:p>
       <w:pPr>
@@ -11527,6 +11768,126 @@
     </w:p>
     <w:p>
       <w:pPr>
+        <w:pStyle w:val="Ttulo3"/>
+      </w:pPr>
+      <w:r>
+        <w:t>INEDITTO cambió el nombre de una columna / El pipeline falla con un error de columna no encontrada</w:t>
+      </w:r>
+    </w:p>
+    <w:p>
+      <w:pPr/>
+    </w:p>
+    <w:p>
+      <w:pPr/>
+      <w:r>
+        <w:t>Síntoma: El pipeline se interrumpe con un mensaje similar a "KeyError: 'NombreColumna'" o "Column 'X' not found", o la tarjeta de un archivo muestra error al cargarlo.</w:t>
+      </w:r>
+    </w:p>
+    <w:p>
+      <w:pPr/>
+    </w:p>
+    <w:p>
+      <w:pPr/>
+      <w:r>
+        <w:t>Causa: INEDITTO actualizó su exportación y renombró una o varias columnas requeridas.</w:t>
+      </w:r>
+    </w:p>
+    <w:p>
+      <w:pPr/>
+    </w:p>
+    <w:p>
+      <w:pPr/>
+      <w:r>
+        <w:t>Solución — opción A (recomendada, validación automática):</w:t>
+      </w:r>
+    </w:p>
+    <w:p>
+      <w:pPr>
+        <w:pStyle w:val="Listaconnmeros"/>
+      </w:pPr>
+      <w:r>
+        <w:t>Vuelva a cargar el archivo con el botón "Examinar" o "Actualizar". Si el sistema detecta columnas faltantes, aparecerá automáticamente el modal de validación.</w:t>
+      </w:r>
+    </w:p>
+    <w:p>
+      <w:pPr>
+        <w:pStyle w:val="Listaconnmeros"/>
+      </w:pPr>
+      <w:r>
+        <w:t>En la columna «Columna detectada más parecida», verifique que la sugerencia automática sea correcta. Corrija con el dropdown si es necesario.</w:t>
+      </w:r>
+    </w:p>
+    <w:p>
+      <w:pPr>
+        <w:pStyle w:val="Listaconnmeros"/>
+      </w:pPr>
+      <w:r>
+        <w:t>Haga clic en "Guardar mapeo". El mapeo quedará guardado permanentemente.</w:t>
+      </w:r>
+    </w:p>
+    <w:p>
+      <w:pPr>
+        <w:pStyle w:val="Listaconnmeros"/>
+      </w:pPr>
+      <w:r>
+        <w:t>Ejecute «Generar Plan» normalmente.</w:t>
+      </w:r>
+    </w:p>
+    <w:p>
+      <w:pPr/>
+    </w:p>
+    <w:p>
+      <w:pPr/>
+      <w:r>
+        <w:t>Solución — opción B (modal maestro):</w:t>
+      </w:r>
+    </w:p>
+    <w:p>
+      <w:pPr>
+        <w:pStyle w:val="Listaconnmeros"/>
+      </w:pPr>
+      <w:r>
+        <w:t>Haga clic en el botón "Mapeo de columnas" en la pestaña «Ordenes de Producción».</w:t>
+      </w:r>
+    </w:p>
+    <w:p>
+      <w:pPr>
+        <w:pStyle w:val="Listaconnmeros"/>
+      </w:pPr>
+      <w:r>
+        <w:t>Seleccione la pestaña del archivo que tiene el problema.</w:t>
+      </w:r>
+    </w:p>
+    <w:p>
+      <w:pPr>
+        <w:pStyle w:val="Listaconnmeros"/>
+      </w:pPr>
+      <w:r>
+        <w:t>En el dropdown de la columna afectada, seleccione el nuevo nombre que aparece en el Excel.</w:t>
+      </w:r>
+    </w:p>
+    <w:p>
+      <w:pPr>
+        <w:pStyle w:val="Listaconnmeros"/>
+      </w:pPr>
+      <w:r>
+        <w:t>Haga clic en "Guardar cambios" y luego ejecute «Generar Plan».</w:t>
+      </w:r>
+    </w:p>
+    <w:p>
+      <w:pPr/>
+    </w:p>
+    <w:p>
+      <w:pPr/>
+      <w:r>
+        <w:t>Nota: El mapeo se guarda en column_mappings.json (carpeta raíz del proyecto). Si desea revertir todos los mapeos, haga clic en "Limpiar todo" dentro del modal maestro.</w:t>
+      </w:r>
+    </w:p>
+    <w:p>
+      <w:pPr/>
+    </w:p>
+    <w:p>
+      <w:pPr>
         <w:pStyle w:val="Ttulo2"/>
         <w:spacing w:before="280" w:after="60"/>
       </w:pPr>
@@ -12049,7 +12410,7 @@
         <w:spacing w:after="80"/>
       </w:pPr>
       <w:r>
-        <w:t>*Manual generado para SeedPack Planner v1.0 — Mayo 2026*</w:t>
+        <w:t>*Manual generado para SeedPack Planner v1.1 — Junio 2026*</w:t>
       </w:r>
     </w:p>
     <w:sectPr>

</xml_diff>